<commit_message>
"Added interests and filtering by rating"
</commit_message>
<xml_diff>
--- a/LibroSphere Recommendation System.docx
+++ b/LibroSphere Recommendation System.docx
@@ -332,7 +332,21 @@
         <w:rPr>
           <w:color w:val="000000" w:themeColor="text1"/>
         </w:rPr>
-        <w:t xml:space="preserve"> knjige sa kojima je korisnik vec imao direktnu interakciju u smislu kupovine, review aktivnosti, wishlist aktivnosti ili shopping cart aktivnosti. Time recommendation lista ostaje fokusirana na sledece potencijalno relevantne naslove.</w:t>
+        <w:t xml:space="preserve"> </w:t>
+      </w:r>
+      <w:proofErr w:type="spellStart"/>
+      <w:r>
+        <w:rPr>
+          <w:color w:val="000000" w:themeColor="text1"/>
+        </w:rPr>
+        <w:t>knjige</w:t>
+      </w:r>
+      <w:proofErr w:type="spellEnd"/>
+      <w:r>
+        <w:rPr>
+          <w:color w:val="000000" w:themeColor="text1"/>
+        </w:rPr>
+        <w:t xml:space="preserve"> sa kojima je korisnik vec imao direktnu interakciju u smislu kupovine, review aktivnosti, wishlist aktivnosti ili shopping cart aktivnosti. Time recommendation lista ostaje fokusirana na sledece potencijalno relevantne naslove.</w:t>
       </w:r>
     </w:p>
     <w:tbl>
@@ -3865,6 +3879,56 @@
           </w:p>
         </w:tc>
       </w:tr>
+      <w:tr>
+        <w:trPr>
+          <w:gridAfter w:val="1"/>
+          <w:wAfter w:w="3312" w:type="dxa"/>
+        </w:trPr>
+        <w:tc>
+          <w:tcPr>
+            <w:tcW w:w="3312" w:type="dxa"/>
+          </w:tcPr>
+          <w:p>
+            <w:pPr>
+              <w:rPr>
+                <w:color w:val="000000" w:themeColor="text1"/>
+              </w:rPr>
+            </w:pPr>
+            <w:proofErr w:type="spellStart"/>
+            <w:r>
+              <w:rPr>
+                <w:color w:val="000000" w:themeColor="text1"/>
+              </w:rPr>
+              <w:t>Fatvorite</w:t>
+            </w:r>
+            <w:proofErr w:type="spellEnd"/>
+            <w:r>
+              <w:rPr>
+                <w:color w:val="000000" w:themeColor="text1"/>
+              </w:rPr>
+              <w:t xml:space="preserve"> authors</w:t>
+            </w:r>
+          </w:p>
+        </w:tc>
+        <w:tc>
+          <w:tcPr>
+            <w:tcW w:w="3312" w:type="dxa"/>
+          </w:tcPr>
+          <w:p>
+            <w:pPr>
+              <w:rPr>
+                <w:color w:val="000000" w:themeColor="text1"/>
+              </w:rPr>
+            </w:pPr>
+            <w:r>
+              <w:rPr>
+                <w:color w:val="000000" w:themeColor="text1"/>
+              </w:rPr>
+              <w:t>3.0</w:t>
+            </w:r>
+          </w:p>
+        </w:tc>
+      </w:tr>
     </w:tbl>
     <w:p>
       <w:pPr>
@@ -4768,6 +4832,7 @@
               <w:rPr>
                 <w:color w:val="000000" w:themeColor="text1"/>
               </w:rPr>
+              <w:lastRenderedPageBreak/>
               <w:t>ExplorationBoost</w:t>
             </w:r>
           </w:p>
@@ -4804,14 +4869,7 @@
               <w:rPr>
                 <w:color w:val="000000" w:themeColor="text1"/>
               </w:rPr>
-              <w:t xml:space="preserve">Daje prostor za umjereno </w:t>
-            </w:r>
-            <w:r>
-              <w:rPr>
-                <w:color w:val="000000" w:themeColor="text1"/>
-              </w:rPr>
-              <w:lastRenderedPageBreak/>
-              <w:t>istrazivanje novih zanrova.</w:t>
+              <w:t>Daje prostor za umjereno istrazivanje novih zanrova.</w:t>
             </w:r>
           </w:p>
         </w:tc>
@@ -6898,7 +6956,49 @@
         <w:rPr>
           <w:color w:val="000000" w:themeColor="text1"/>
         </w:rPr>
-        <w:t xml:space="preserve"> kod kljucnih komponenti recommendation sistema, kako bi dokument sadrzao i objasnjenje </w:t>
+        <w:t xml:space="preserve"> kod kljucnih komponenti recommendation sistema, kako bi dokument </w:t>
+      </w:r>
+      <w:proofErr w:type="spellStart"/>
+      <w:r>
+        <w:rPr>
+          <w:color w:val="000000" w:themeColor="text1"/>
+        </w:rPr>
+        <w:t>sadrzao</w:t>
+      </w:r>
+      <w:proofErr w:type="spellEnd"/>
+      <w:r>
+        <w:rPr>
+          <w:color w:val="000000" w:themeColor="text1"/>
+        </w:rPr>
+        <w:t xml:space="preserve"> </w:t>
+      </w:r>
+      <w:proofErr w:type="spellStart"/>
+      <w:r>
+        <w:rPr>
+          <w:color w:val="000000" w:themeColor="text1"/>
+        </w:rPr>
+        <w:t>i</w:t>
+      </w:r>
+      <w:proofErr w:type="spellEnd"/>
+      <w:r>
+        <w:rPr>
+          <w:color w:val="000000" w:themeColor="text1"/>
+        </w:rPr>
+        <w:t xml:space="preserve"> </w:t>
+      </w:r>
+      <w:proofErr w:type="spellStart"/>
+      <w:r>
+        <w:rPr>
+          <w:color w:val="000000" w:themeColor="text1"/>
+        </w:rPr>
+        <w:t>objasnjenje</w:t>
+      </w:r>
+      <w:proofErr w:type="spellEnd"/>
+      <w:r>
+        <w:rPr>
+          <w:color w:val="000000" w:themeColor="text1"/>
+        </w:rPr>
+        <w:t xml:space="preserve"> </w:t>
       </w:r>
       <w:proofErr w:type="spellStart"/>
       <w:r>

</xml_diff>